<commit_message>
Update reports for attraction-specific custom event
</commit_message>
<xml_diff>
--- a/Final_Report_WebAnalytics_GA4_EN.docx
+++ b/Final_Report_WebAnalytics_GA4_EN.docx
@@ -252,13 +252,29 @@
         <w:pStyle w:val="ListBullet"/>
       </w:pPr>
       <w:r>
-        <w:t>Copy parameters from source event: Enabled (copies `place`, `total_votes`, etc.)</w:t>
+        <w:t>Additional condition (parameter filter):</w:t>
+      </w:r>
+    </w:p>
+    <w:p>
+      <w:pPr>
+        <w:pStyle w:val="ListBullet"/>
+      </w:pPr>
+      <w:r>
+        <w:t>`place` equals `瘦西湖`</w:t>
+      </w:r>
+    </w:p>
+    <w:p>
+      <w:pPr>
+        <w:pStyle w:val="ListBullet"/>
+      </w:pPr>
+      <w:r>
+        <w:t>Copy parameters from source event: Disabled (not required for counting; optional if you want to keep parameters in the derived event)</w:t>
       </w:r>
     </w:p>
     <w:p/>
     <w:p>
       <w:r>
-        <w:t>This custom event is used as evidence of “custom event created in the GA4 interface” and can be used as the measurement target in Phase 3 (e.g., +10%).</w:t>
+        <w:t>This custom event is used as evidence of “custom event created in the GA4 interface” and can also be used to measure votes for a specific attraction (“Shouxihu”) as a focused KPI target.</w:t>
       </w:r>
     </w:p>
     <w:p/>
@@ -358,7 +374,7 @@
         <w:pStyle w:val="ListBullet"/>
       </w:pPr>
       <w:r>
-        <w:t>Definition: Event count of `vote_submit` (or `vote_submit_custom`)</w:t>
+        <w:t>Definition: Event count of `vote_submit` (overall vote submissions)</w:t>
       </w:r>
     </w:p>
     <w:p>
@@ -399,6 +415,22 @@
       </w:pPr>
       <w:r>
         <w:t>Definition: Event count of `vote_results_view`, or `vote_results_view` / `vote_page_view`</w:t>
+      </w:r>
+    </w:p>
+    <w:p>
+      <w:pPr>
+        <w:pStyle w:val="ListNumber"/>
+      </w:pPr>
+      <w:r>
+        <w:t>4. Attraction-specific vote KPI (optional)</w:t>
+      </w:r>
+    </w:p>
+    <w:p>
+      <w:pPr>
+        <w:pStyle w:val="ListBullet"/>
+      </w:pPr>
+      <w:r>
+        <w:t>Definition: Event count of `vote_submit_custom` (only when `place = 瘦西湖`)</w:t>
       </w:r>
     </w:p>
     <w:p/>
@@ -677,7 +709,7 @@
         <w:pStyle w:val="ListBullet"/>
       </w:pPr>
       <w:r>
-        <w:t>Target: Increase `vote_submit_custom` (or `vote_submit`) by 10%</w:t>
+        <w:t>Target: Increase `vote_submit_custom` (votes for “瘦西湖”) by 10%</w:t>
       </w:r>
     </w:p>
     <w:p>
@@ -769,7 +801,6 @@
         <w:t>This project successfully implemented GA4 tracking, configured custom interaction events for the voting flow, and created an additional custom event (`vote_submit_custom`) through the GA4 Events Interface. Using GA4 Funnel exploration, the project identified the main drop-off step and proposed actionable improvements with a measurable +10% growth target. Overall, the work meets the evaluation criteria of technical accuracy, strategic KPI alignment, and analytical insight.</w:t>
       </w:r>
     </w:p>
-    <w:p/>
     <w:sectPr>
       <w:pgSz w:w="12240" w:h="15840"/>
       <w:pgMar w:top="1440" w:right="1800" w:bottom="1440" w:left="1800" w:header="720" w:footer="720" w:gutter="0"/>

</xml_diff>